<commit_message>
refinement：support range select,divide rules into match and renumber
</commit_message>
<xml_diff>
--- a/test.docx
+++ b/test.docx
@@ -646,12 +646,6 @@
             <w:insideH w:val="none" w:color="auto" w:sz="0" w:space="0"/>
             <w:insideV w:val="none" w:color="auto" w:sz="0" w:space="0"/>
           </w:tblBorders>
-          <w:tblCellMar>
-            <w:top w:w="0" w:type="dxa"/>
-            <w:left w:w="0" w:type="dxa"/>
-            <w:bottom w:w="0" w:type="dxa"/>
-            <w:right w:w="0" w:type="dxa"/>
-          </w:tblCellMar>
         </w:tblPrEx>
         <w:trPr>
           <w:trHeight w:val="20" w:hRule="atLeast"/>
@@ -1088,344 +1082,1174 @@
     <w:p>
       <w:pPr>
         <w:ind w:firstLine="480"/>
+        <w:rPr>
+          <w:rFonts w:hint="eastAsia"/>
+        </w:rPr>
       </w:pPr>
-      <w:r>
-        <w:rPr>
-          <w:rFonts w:hint="eastAsia"/>
-        </w:rPr>
-        <w:t>由图</w:t>
-      </w:r>
-      <w:r>
-        <w:rPr>
-          <w:rFonts w:hint="eastAsia"/>
-          <w:lang w:val="en-US" w:eastAsia="zh-CN"/>
-        </w:rPr>
-        <w:t>4</w:t>
-      </w:r>
-      <w:bookmarkStart w:id="7" w:name="_GoBack"/>
-      <w:bookmarkEnd w:id="7"/>
-      <w:r>
-        <w:rPr>
-          <w:rFonts w:hint="eastAsia"/>
-        </w:rPr>
-        <w:t>-57可以看到，在25个测试点中，降阶模型的最大绝对平均误差及最大相对平均误差出现在工况：</w:t>
-      </w:r>
-      <w:r>
-        <w:rPr>
-          <w:rFonts w:hint="eastAsia"/>
-          <w:i/>
-          <w:iCs/>
-        </w:rPr>
-        <w:t>T</w:t>
-      </w:r>
-      <w:r>
-        <w:rPr>
-          <w:rFonts w:hint="eastAsia"/>
-          <w:vertAlign w:val="subscript"/>
-        </w:rPr>
-        <w:t>0</w:t>
-      </w:r>
-      <w:r>
-        <w:rPr>
-          <w:rFonts w:hint="eastAsia"/>
-        </w:rPr>
-        <w:t>=-8.85℃，</w:t>
-      </w:r>
-      <w:r>
-        <w:rPr>
-          <w:rFonts w:hint="eastAsia"/>
-          <w:i/>
-          <w:iCs/>
-        </w:rPr>
-        <w:t>P</w:t>
-      </w:r>
-      <w:r>
-        <w:rPr>
-          <w:rFonts w:hint="eastAsia"/>
-          <w:i/>
-          <w:iCs/>
-          <w:vertAlign w:val="subscript"/>
-        </w:rPr>
-        <w:t>h</w:t>
-      </w:r>
-      <w:r>
-        <w:rPr>
-          <w:rFonts w:hint="eastAsia"/>
-        </w:rPr>
-        <w:t xml:space="preserve"> =29.98kW，</w:t>
-      </w:r>
-      <w:r>
-        <w:rPr>
-          <w:rFonts w:hint="eastAsia"/>
-          <w:i/>
-          <w:iCs/>
-        </w:rPr>
-        <w:t>P</w:t>
-      </w:r>
-      <w:r>
-        <w:rPr>
-          <w:rFonts w:hint="eastAsia"/>
-          <w:i/>
-          <w:iCs/>
-          <w:vertAlign w:val="subscript"/>
-        </w:rPr>
-        <w:t>m</w:t>
-      </w:r>
-      <w:r>
-        <w:rPr>
-          <w:rFonts w:hint="eastAsia"/>
-        </w:rPr>
-        <w:t xml:space="preserve"> =20.12kW，误差分别为0.20℃和0.95%，其余各工况的降阶计算绝对误差均不超过0.15℃，且相对平均误差均不超过0.38%。由此，可说明本项目所提POD-RBFLP降阶算法具有较高的计算精度。</w:t>
-      </w:r>
+      <w:bookmarkStart w:id="5" w:name="_GoBack"/>
+      <w:bookmarkEnd w:id="5"/>
     </w:p>
     <w:p>
       <w:pPr>
-        <w:ind w:firstLine="480"/>
+        <w:spacing w:line="300" w:lineRule="auto"/>
+        <w:ind w:firstLine="480" w:firstLineChars="200"/>
+        <w:rPr>
+          <w:rFonts w:ascii="Times New Roman" w:hAnsi="Times New Roman" w:eastAsia="宋体" w:cs="Times New Roman"/>
+          <w:color w:val="000000"/>
+          <w:kern w:val="2"/>
+          <w:sz w:val="24"/>
+        </w:rPr>
       </w:pPr>
       <w:r>
         <w:rPr>
-          <w:rFonts w:hint="eastAsia"/>
-        </w:rPr>
-        <w:t>此外，仅考虑降阶模型建立之后的效率提升，POD-RBFLP算法计算25个测试工况仅需1.568s，且相较于Fluent单线程仿真计算时间9072.18s也有近万倍的效率提升，这充分说明了本项目所提算法的高效性，满足当下对于数字孪生模型快速计算的要求。</w:t>
+          <w:rFonts w:hint="eastAsia" w:ascii="Times New Roman" w:hAnsi="Times New Roman" w:eastAsia="宋体" w:cs="Times New Roman"/>
+          <w:kern w:val="2"/>
+          <w:sz w:val="24"/>
+        </w:rPr>
+        <w:t>同时，记录各测量线饼在试验过程中的误差情况如</w:t>
+      </w:r>
+      <w:r>
+        <w:rPr>
+          <w:rFonts w:ascii="Times New Roman" w:hAnsi="Times New Roman" w:eastAsia="宋体" w:cs="Times New Roman"/>
+          <w:color w:val="000000"/>
+          <w:kern w:val="2"/>
+          <w:sz w:val="24"/>
+          <w:szCs w:val="24"/>
+        </w:rPr>
+        <w:fldChar w:fldCharType="begin"/>
+      </w:r>
+      <w:r>
+        <w:rPr>
+          <w:rFonts w:ascii="Times New Roman" w:hAnsi="Times New Roman" w:eastAsia="宋体" w:cs="Times New Roman"/>
+          <w:kern w:val="2"/>
+          <w:sz w:val="24"/>
+          <w:szCs w:val="24"/>
+        </w:rPr>
+        <w:instrText xml:space="preserve"> </w:instrText>
+      </w:r>
+      <w:r>
+        <w:rPr>
+          <w:rFonts w:hint="eastAsia" w:ascii="Times New Roman" w:hAnsi="Times New Roman" w:eastAsia="宋体" w:cs="Times New Roman"/>
+          <w:kern w:val="2"/>
+          <w:sz w:val="24"/>
+          <w:szCs w:val="24"/>
+        </w:rPr>
+        <w:instrText xml:space="preserve">REF _Ref156475702 \h</w:instrText>
+      </w:r>
+      <w:r>
+        <w:rPr>
+          <w:rFonts w:ascii="Times New Roman" w:hAnsi="Times New Roman" w:eastAsia="宋体" w:cs="Times New Roman"/>
+          <w:kern w:val="2"/>
+          <w:sz w:val="24"/>
+          <w:szCs w:val="24"/>
+        </w:rPr>
+        <w:instrText xml:space="preserve"> </w:instrText>
+      </w:r>
+      <w:r>
+        <w:rPr>
+          <w:rFonts w:ascii="Times New Roman" w:hAnsi="Times New Roman" w:eastAsia="宋体" w:cs="Times New Roman"/>
+          <w:color w:val="000000"/>
+          <w:kern w:val="2"/>
+          <w:sz w:val="24"/>
+          <w:szCs w:val="24"/>
+        </w:rPr>
+        <w:instrText xml:space="preserve"> \* MERGEFORMAT </w:instrText>
+      </w:r>
+      <w:r>
+        <w:rPr>
+          <w:rFonts w:ascii="Times New Roman" w:hAnsi="Times New Roman" w:eastAsia="宋体" w:cs="Times New Roman"/>
+          <w:color w:val="000000"/>
+          <w:kern w:val="2"/>
+          <w:sz w:val="24"/>
+          <w:szCs w:val="24"/>
+        </w:rPr>
+        <w:fldChar w:fldCharType="separate"/>
+      </w:r>
+      <w:r>
+        <w:rPr>
+          <w:rFonts w:ascii="Times New Roman" w:hAnsi="Times New Roman" w:eastAsia="宋体" w:cs="Times New Roman"/>
+          <w:kern w:val="2"/>
+          <w:sz w:val="24"/>
+          <w:szCs w:val="24"/>
+        </w:rPr>
+        <w:t>表3-1</w:t>
+      </w:r>
+      <w:r>
+        <w:rPr>
+          <w:rFonts w:ascii="Times New Roman" w:hAnsi="Times New Roman" w:eastAsia="宋体" w:cs="Times New Roman"/>
+          <w:color w:val="000000"/>
+          <w:kern w:val="2"/>
+          <w:sz w:val="24"/>
+          <w:szCs w:val="24"/>
+        </w:rPr>
+        <w:fldChar w:fldCharType="end"/>
+      </w:r>
+      <w:r>
+        <w:rPr>
+          <w:rFonts w:hint="eastAsia" w:ascii="Times New Roman" w:hAnsi="Times New Roman" w:eastAsia="宋体" w:cs="Times New Roman"/>
+          <w:color w:val="000000"/>
+          <w:kern w:val="2"/>
+          <w:sz w:val="24"/>
+        </w:rPr>
+        <w:t>所示：</w:t>
       </w:r>
     </w:p>
     <w:p>
       <w:pPr>
-        <w:pStyle w:val="5"/>
+        <w:spacing w:line="300" w:lineRule="auto"/>
+        <w:ind w:firstLine="0" w:firstLineChars="0"/>
+        <w:jc w:val="center"/>
+        <w:rPr>
+          <w:rFonts w:ascii="Times New Roman" w:hAnsi="Times New Roman" w:eastAsia="宋体" w:cs="Times New Roman"/>
+          <w:color w:val="000000"/>
+          <w:kern w:val="2"/>
+          <w:sz w:val="21"/>
+          <w:szCs w:val="21"/>
+        </w:rPr>
       </w:pPr>
-      <w:bookmarkStart w:id="4" w:name="_Toc30514"/>
-      <w:r>
-        <w:rPr>
-          <w:rFonts w:hint="eastAsia"/>
-        </w:rPr>
-        <w:t>3.2.2.3 结构力场降阶模型</w:t>
+      <w:bookmarkStart w:id="4" w:name="_Ref156475702"/>
+      <w:r>
+        <w:rPr>
+          <w:rFonts w:ascii="Times New Roman" w:hAnsi="Times New Roman" w:eastAsia="宋体" w:cs="Times New Roman"/>
+          <w:kern w:val="2"/>
+          <w:sz w:val="21"/>
+          <w:szCs w:val="21"/>
+        </w:rPr>
+        <w:t>表3-</w:t>
+      </w:r>
+      <w:r>
+        <w:rPr>
+          <w:rFonts w:ascii="Times New Roman" w:hAnsi="Times New Roman" w:eastAsia="宋体" w:cs="Times New Roman"/>
+          <w:kern w:val="2"/>
+          <w:sz w:val="21"/>
+          <w:szCs w:val="21"/>
+        </w:rPr>
+        <w:fldChar w:fldCharType="begin"/>
+      </w:r>
+      <w:r>
+        <w:rPr>
+          <w:rFonts w:ascii="Times New Roman" w:hAnsi="Times New Roman" w:eastAsia="宋体" w:cs="Times New Roman"/>
+          <w:kern w:val="2"/>
+          <w:sz w:val="21"/>
+          <w:szCs w:val="21"/>
+        </w:rPr>
+        <w:instrText xml:space="preserve"> SEQ 表3- \* ARABIC </w:instrText>
+      </w:r>
+      <w:r>
+        <w:rPr>
+          <w:rFonts w:ascii="Times New Roman" w:hAnsi="Times New Roman" w:eastAsia="宋体" w:cs="Times New Roman"/>
+          <w:kern w:val="2"/>
+          <w:sz w:val="21"/>
+          <w:szCs w:val="21"/>
+        </w:rPr>
+        <w:fldChar w:fldCharType="separate"/>
+      </w:r>
+      <w:r>
+        <w:rPr>
+          <w:rFonts w:ascii="Times New Roman" w:hAnsi="Times New Roman" w:eastAsia="宋体" w:cs="Times New Roman"/>
+          <w:kern w:val="2"/>
+          <w:sz w:val="21"/>
+          <w:szCs w:val="21"/>
+        </w:rPr>
+        <w:t>1</w:t>
+      </w:r>
+      <w:r>
+        <w:rPr>
+          <w:rFonts w:ascii="Times New Roman" w:hAnsi="Times New Roman" w:eastAsia="宋体" w:cs="Times New Roman"/>
+          <w:kern w:val="2"/>
+          <w:sz w:val="21"/>
+          <w:szCs w:val="21"/>
+        </w:rPr>
+        <w:fldChar w:fldCharType="end"/>
       </w:r>
       <w:bookmarkEnd w:id="4"/>
+      <w:r>
+        <w:rPr>
+          <w:rFonts w:ascii="Times New Roman" w:hAnsi="Times New Roman" w:eastAsia="宋体" w:cs="Times New Roman"/>
+          <w:color w:val="000000"/>
+          <w:kern w:val="2"/>
+          <w:sz w:val="21"/>
+          <w:szCs w:val="21"/>
+        </w:rPr>
+        <w:t xml:space="preserve">  各测量线饼瞬态计算误差</w:t>
+      </w:r>
     </w:p>
+    <w:tbl>
+      <w:tblPr>
+        <w:tblStyle w:val="15"/>
+        <w:tblW w:w="0" w:type="auto"/>
+        <w:jc w:val="center"/>
+        <w:tblBorders>
+          <w:top w:val="single" w:color="auto" w:sz="6" w:space="0"/>
+          <w:left w:val="none" w:color="auto" w:sz="0" w:space="0"/>
+          <w:bottom w:val="single" w:color="auto" w:sz="6" w:space="0"/>
+          <w:right w:val="none" w:color="auto" w:sz="0" w:space="0"/>
+          <w:insideH w:val="single" w:color="auto" w:sz="4" w:space="0"/>
+          <w:insideV w:val="none" w:color="auto" w:sz="0" w:space="0"/>
+        </w:tblBorders>
+        <w:tblLayout w:type="autofit"/>
+        <w:tblCellMar>
+          <w:top w:w="0" w:type="dxa"/>
+          <w:left w:w="108" w:type="dxa"/>
+          <w:bottom w:w="0" w:type="dxa"/>
+          <w:right w:w="108" w:type="dxa"/>
+        </w:tblCellMar>
+      </w:tblPr>
+      <w:tblGrid>
+        <w:gridCol w:w="892"/>
+        <w:gridCol w:w="1230"/>
+        <w:gridCol w:w="1275"/>
+        <w:gridCol w:w="1134"/>
+      </w:tblGrid>
+      <w:tr>
+        <w:tblPrEx>
+          <w:tblBorders>
+            <w:top w:val="single" w:color="auto" w:sz="6" w:space="0"/>
+            <w:left w:val="none" w:color="auto" w:sz="0" w:space="0"/>
+            <w:bottom w:val="single" w:color="auto" w:sz="6" w:space="0"/>
+            <w:right w:val="none" w:color="auto" w:sz="0" w:space="0"/>
+            <w:insideH w:val="single" w:color="auto" w:sz="4" w:space="0"/>
+            <w:insideV w:val="none" w:color="auto" w:sz="0" w:space="0"/>
+          </w:tblBorders>
+          <w:tblCellMar>
+            <w:top w:w="0" w:type="dxa"/>
+            <w:left w:w="108" w:type="dxa"/>
+            <w:bottom w:w="0" w:type="dxa"/>
+            <w:right w:w="108" w:type="dxa"/>
+          </w:tblCellMar>
+        </w:tblPrEx>
+        <w:trPr>
+          <w:jc w:val="center"/>
+        </w:trPr>
+        <w:tc>
+          <w:tcPr>
+            <w:tcW w:w="892" w:type="dxa"/>
+            <w:tcBorders>
+              <w:bottom w:val="single" w:color="auto" w:sz="4" w:space="0"/>
+            </w:tcBorders>
+          </w:tcPr>
+          <w:p>
+            <w:pPr>
+              <w:snapToGrid w:val="0"/>
+              <w:spacing w:line="300" w:lineRule="auto"/>
+              <w:ind w:firstLine="0" w:firstLineChars="0"/>
+              <w:rPr>
+                <w:rFonts w:ascii="Times New Roman" w:hAnsi="Times New Roman" w:eastAsia="宋体" w:cs="Times New Roman"/>
+                <w:color w:val="000000"/>
+                <w:kern w:val="2"/>
+                <w:sz w:val="15"/>
+                <w:szCs w:val="15"/>
+              </w:rPr>
+            </w:pPr>
+          </w:p>
+        </w:tc>
+        <w:tc>
+          <w:tcPr>
+            <w:tcW w:w="1230" w:type="dxa"/>
+            <w:tcBorders>
+              <w:bottom w:val="single" w:color="auto" w:sz="4" w:space="0"/>
+            </w:tcBorders>
+          </w:tcPr>
+          <w:p>
+            <w:pPr>
+              <w:snapToGrid w:val="0"/>
+              <w:spacing w:line="300" w:lineRule="auto"/>
+              <w:ind w:firstLine="0" w:firstLineChars="0"/>
+              <w:rPr>
+                <w:rFonts w:ascii="Times New Roman" w:hAnsi="Times New Roman" w:eastAsia="宋体" w:cs="Times New Roman"/>
+                <w:color w:val="000000"/>
+                <w:kern w:val="2"/>
+                <w:sz w:val="15"/>
+                <w:szCs w:val="15"/>
+              </w:rPr>
+            </w:pPr>
+            <w:r>
+              <w:rPr>
+                <w:rFonts w:hint="eastAsia" w:ascii="Times New Roman" w:hAnsi="Times New Roman" w:eastAsia="宋体" w:cs="Times New Roman"/>
+                <w:color w:val="000000"/>
+                <w:kern w:val="2"/>
+                <w:sz w:val="15"/>
+                <w:szCs w:val="15"/>
+              </w:rPr>
+              <w:t>最大误差/</w:t>
+            </w:r>
+            <w:r>
+              <w:rPr>
+                <w:rFonts w:ascii="Times New Roman" w:hAnsi="Times New Roman" w:eastAsia="宋体" w:cs="Times New Roman"/>
+                <w:color w:val="000000"/>
+                <w:kern w:val="2"/>
+                <w:sz w:val="15"/>
+                <w:szCs w:val="15"/>
+              </w:rPr>
+              <w:t>K</w:t>
+            </w:r>
+          </w:p>
+        </w:tc>
+        <w:tc>
+          <w:tcPr>
+            <w:tcW w:w="1275" w:type="dxa"/>
+            <w:tcBorders>
+              <w:bottom w:val="single" w:color="auto" w:sz="4" w:space="0"/>
+            </w:tcBorders>
+          </w:tcPr>
+          <w:p>
+            <w:pPr>
+              <w:snapToGrid w:val="0"/>
+              <w:spacing w:line="300" w:lineRule="auto"/>
+              <w:ind w:firstLine="0" w:firstLineChars="0"/>
+              <w:rPr>
+                <w:rFonts w:ascii="Times New Roman" w:hAnsi="Times New Roman" w:eastAsia="宋体" w:cs="Times New Roman"/>
+                <w:color w:val="000000"/>
+                <w:kern w:val="2"/>
+                <w:sz w:val="15"/>
+                <w:szCs w:val="15"/>
+              </w:rPr>
+            </w:pPr>
+            <w:r>
+              <w:rPr>
+                <w:rFonts w:hint="eastAsia" w:ascii="Times New Roman" w:hAnsi="Times New Roman" w:eastAsia="宋体" w:cs="Times New Roman"/>
+                <w:color w:val="000000"/>
+                <w:kern w:val="2"/>
+                <w:sz w:val="15"/>
+                <w:szCs w:val="15"/>
+              </w:rPr>
+              <w:t>热点误差/</w:t>
+            </w:r>
+            <w:r>
+              <w:rPr>
+                <w:rFonts w:ascii="Times New Roman" w:hAnsi="Times New Roman" w:eastAsia="宋体" w:cs="Times New Roman"/>
+                <w:color w:val="000000"/>
+                <w:kern w:val="2"/>
+                <w:sz w:val="15"/>
+                <w:szCs w:val="15"/>
+              </w:rPr>
+              <w:t>K</w:t>
+            </w:r>
+          </w:p>
+        </w:tc>
+        <w:tc>
+          <w:tcPr>
+            <w:tcW w:w="1134" w:type="dxa"/>
+            <w:tcBorders>
+              <w:bottom w:val="single" w:color="auto" w:sz="4" w:space="0"/>
+            </w:tcBorders>
+          </w:tcPr>
+          <w:p>
+            <w:pPr>
+              <w:snapToGrid w:val="0"/>
+              <w:spacing w:line="300" w:lineRule="auto"/>
+              <w:ind w:firstLine="0" w:firstLineChars="0"/>
+              <w:rPr>
+                <w:rFonts w:ascii="Times New Roman" w:hAnsi="Times New Roman" w:eastAsia="宋体" w:cs="Times New Roman"/>
+                <w:color w:val="000000"/>
+                <w:kern w:val="2"/>
+                <w:sz w:val="15"/>
+                <w:szCs w:val="15"/>
+              </w:rPr>
+            </w:pPr>
+            <w:r>
+              <w:rPr>
+                <w:rFonts w:hint="eastAsia" w:ascii="Times New Roman" w:hAnsi="Times New Roman" w:eastAsia="宋体" w:cs="Times New Roman"/>
+                <w:color w:val="000000"/>
+                <w:kern w:val="2"/>
+                <w:sz w:val="15"/>
+                <w:szCs w:val="15"/>
+              </w:rPr>
+              <w:t>平均误差/</w:t>
+            </w:r>
+            <w:r>
+              <w:rPr>
+                <w:rFonts w:ascii="Times New Roman" w:hAnsi="Times New Roman" w:eastAsia="宋体" w:cs="Times New Roman"/>
+                <w:color w:val="000000"/>
+                <w:kern w:val="2"/>
+                <w:sz w:val="15"/>
+                <w:szCs w:val="15"/>
+              </w:rPr>
+              <w:t>K</w:t>
+            </w:r>
+          </w:p>
+        </w:tc>
+      </w:tr>
+      <w:tr>
+        <w:tblPrEx>
+          <w:tblBorders>
+            <w:top w:val="single" w:color="auto" w:sz="6" w:space="0"/>
+            <w:left w:val="none" w:color="auto" w:sz="0" w:space="0"/>
+            <w:bottom w:val="single" w:color="auto" w:sz="6" w:space="0"/>
+            <w:right w:val="none" w:color="auto" w:sz="0" w:space="0"/>
+            <w:insideH w:val="single" w:color="auto" w:sz="4" w:space="0"/>
+            <w:insideV w:val="none" w:color="auto" w:sz="0" w:space="0"/>
+          </w:tblBorders>
+          <w:tblCellMar>
+            <w:top w:w="0" w:type="dxa"/>
+            <w:left w:w="108" w:type="dxa"/>
+            <w:bottom w:w="0" w:type="dxa"/>
+            <w:right w:w="108" w:type="dxa"/>
+          </w:tblCellMar>
+        </w:tblPrEx>
+        <w:trPr>
+          <w:jc w:val="center"/>
+        </w:trPr>
+        <w:tc>
+          <w:tcPr>
+            <w:tcW w:w="892" w:type="dxa"/>
+            <w:tcBorders>
+              <w:top w:val="single" w:color="auto" w:sz="4" w:space="0"/>
+              <w:bottom w:val="nil"/>
+            </w:tcBorders>
+          </w:tcPr>
+          <w:p>
+            <w:pPr>
+              <w:snapToGrid w:val="0"/>
+              <w:spacing w:line="300" w:lineRule="auto"/>
+              <w:ind w:firstLine="0" w:firstLineChars="0"/>
+              <w:rPr>
+                <w:rFonts w:ascii="Times New Roman" w:hAnsi="Times New Roman" w:eastAsia="宋体" w:cs="Times New Roman"/>
+                <w:color w:val="000000"/>
+                <w:kern w:val="2"/>
+                <w:sz w:val="15"/>
+                <w:szCs w:val="15"/>
+              </w:rPr>
+            </w:pPr>
+            <w:r>
+              <w:rPr>
+                <w:rFonts w:hint="eastAsia" w:ascii="Times New Roman" w:hAnsi="Times New Roman" w:eastAsia="宋体" w:cs="Times New Roman"/>
+                <w:color w:val="000000"/>
+                <w:kern w:val="2"/>
+                <w:sz w:val="15"/>
+                <w:szCs w:val="15"/>
+              </w:rPr>
+              <w:t>线饼1</w:t>
+            </w:r>
+            <w:r>
+              <w:rPr>
+                <w:rFonts w:ascii="Times New Roman" w:hAnsi="Times New Roman" w:eastAsia="宋体" w:cs="Times New Roman"/>
+                <w:color w:val="000000"/>
+                <w:kern w:val="2"/>
+                <w:sz w:val="15"/>
+                <w:szCs w:val="15"/>
+              </w:rPr>
+              <w:t>2</w:t>
+            </w:r>
+          </w:p>
+        </w:tc>
+        <w:tc>
+          <w:tcPr>
+            <w:tcW w:w="1230" w:type="dxa"/>
+            <w:tcBorders>
+              <w:top w:val="single" w:color="auto" w:sz="4" w:space="0"/>
+              <w:bottom w:val="nil"/>
+            </w:tcBorders>
+          </w:tcPr>
+          <w:p>
+            <w:pPr>
+              <w:snapToGrid w:val="0"/>
+              <w:spacing w:line="300" w:lineRule="auto"/>
+              <w:ind w:firstLine="0" w:firstLineChars="0"/>
+              <w:rPr>
+                <w:rFonts w:ascii="Times New Roman" w:hAnsi="Times New Roman" w:eastAsia="宋体" w:cs="Times New Roman"/>
+                <w:color w:val="000000"/>
+                <w:kern w:val="2"/>
+                <w:sz w:val="15"/>
+                <w:szCs w:val="15"/>
+              </w:rPr>
+            </w:pPr>
+            <w:r>
+              <w:rPr>
+                <w:rFonts w:hint="eastAsia" w:ascii="Times New Roman" w:hAnsi="Times New Roman" w:eastAsia="宋体" w:cs="Times New Roman"/>
+                <w:color w:val="000000"/>
+                <w:kern w:val="2"/>
+                <w:sz w:val="15"/>
+                <w:szCs w:val="15"/>
+              </w:rPr>
+              <w:t>4</w:t>
+            </w:r>
+            <w:r>
+              <w:rPr>
+                <w:rFonts w:ascii="Times New Roman" w:hAnsi="Times New Roman" w:eastAsia="宋体" w:cs="Times New Roman"/>
+                <w:color w:val="000000"/>
+                <w:kern w:val="2"/>
+                <w:sz w:val="15"/>
+                <w:szCs w:val="15"/>
+              </w:rPr>
+              <w:t>.67</w:t>
+            </w:r>
+          </w:p>
+        </w:tc>
+        <w:tc>
+          <w:tcPr>
+            <w:tcW w:w="1275" w:type="dxa"/>
+            <w:tcBorders>
+              <w:top w:val="single" w:color="auto" w:sz="4" w:space="0"/>
+              <w:bottom w:val="nil"/>
+            </w:tcBorders>
+          </w:tcPr>
+          <w:p>
+            <w:pPr>
+              <w:snapToGrid w:val="0"/>
+              <w:spacing w:line="300" w:lineRule="auto"/>
+              <w:ind w:firstLine="0" w:firstLineChars="0"/>
+              <w:rPr>
+                <w:rFonts w:ascii="Times New Roman" w:hAnsi="Times New Roman" w:eastAsia="宋体" w:cs="Times New Roman"/>
+                <w:color w:val="000000"/>
+                <w:kern w:val="2"/>
+                <w:sz w:val="15"/>
+                <w:szCs w:val="15"/>
+              </w:rPr>
+            </w:pPr>
+            <w:r>
+              <w:rPr>
+                <w:rFonts w:hint="eastAsia" w:ascii="Times New Roman" w:hAnsi="Times New Roman" w:eastAsia="宋体" w:cs="Times New Roman"/>
+                <w:color w:val="000000"/>
+                <w:kern w:val="2"/>
+                <w:sz w:val="15"/>
+                <w:szCs w:val="15"/>
+              </w:rPr>
+              <w:t>3</w:t>
+            </w:r>
+            <w:r>
+              <w:rPr>
+                <w:rFonts w:ascii="Times New Roman" w:hAnsi="Times New Roman" w:eastAsia="宋体" w:cs="Times New Roman"/>
+                <w:color w:val="000000"/>
+                <w:kern w:val="2"/>
+                <w:sz w:val="15"/>
+                <w:szCs w:val="15"/>
+              </w:rPr>
+              <w:t>.17</w:t>
+            </w:r>
+          </w:p>
+        </w:tc>
+        <w:tc>
+          <w:tcPr>
+            <w:tcW w:w="1134" w:type="dxa"/>
+            <w:tcBorders>
+              <w:top w:val="single" w:color="auto" w:sz="4" w:space="0"/>
+              <w:bottom w:val="nil"/>
+            </w:tcBorders>
+          </w:tcPr>
+          <w:p>
+            <w:pPr>
+              <w:snapToGrid w:val="0"/>
+              <w:spacing w:line="300" w:lineRule="auto"/>
+              <w:ind w:firstLine="0" w:firstLineChars="0"/>
+              <w:rPr>
+                <w:rFonts w:ascii="Times New Roman" w:hAnsi="Times New Roman" w:eastAsia="宋体" w:cs="Times New Roman"/>
+                <w:color w:val="000000"/>
+                <w:kern w:val="2"/>
+                <w:sz w:val="15"/>
+                <w:szCs w:val="15"/>
+              </w:rPr>
+            </w:pPr>
+            <w:r>
+              <w:rPr>
+                <w:rFonts w:hint="eastAsia" w:ascii="Times New Roman" w:hAnsi="Times New Roman" w:eastAsia="宋体" w:cs="Times New Roman"/>
+                <w:color w:val="000000"/>
+                <w:kern w:val="2"/>
+                <w:sz w:val="15"/>
+                <w:szCs w:val="15"/>
+              </w:rPr>
+              <w:t>1</w:t>
+            </w:r>
+            <w:r>
+              <w:rPr>
+                <w:rFonts w:ascii="Times New Roman" w:hAnsi="Times New Roman" w:eastAsia="宋体" w:cs="Times New Roman"/>
+                <w:color w:val="000000"/>
+                <w:kern w:val="2"/>
+                <w:sz w:val="15"/>
+                <w:szCs w:val="15"/>
+              </w:rPr>
+              <w:t>.00</w:t>
+            </w:r>
+          </w:p>
+        </w:tc>
+      </w:tr>
+      <w:tr>
+        <w:tblPrEx>
+          <w:tblBorders>
+            <w:top w:val="single" w:color="auto" w:sz="6" w:space="0"/>
+            <w:left w:val="none" w:color="auto" w:sz="0" w:space="0"/>
+            <w:bottom w:val="single" w:color="auto" w:sz="6" w:space="0"/>
+            <w:right w:val="none" w:color="auto" w:sz="0" w:space="0"/>
+            <w:insideH w:val="single" w:color="auto" w:sz="4" w:space="0"/>
+            <w:insideV w:val="none" w:color="auto" w:sz="0" w:space="0"/>
+          </w:tblBorders>
+          <w:tblCellMar>
+            <w:top w:w="0" w:type="dxa"/>
+            <w:left w:w="108" w:type="dxa"/>
+            <w:bottom w:w="0" w:type="dxa"/>
+            <w:right w:w="108" w:type="dxa"/>
+          </w:tblCellMar>
+        </w:tblPrEx>
+        <w:trPr>
+          <w:jc w:val="center"/>
+        </w:trPr>
+        <w:tc>
+          <w:tcPr>
+            <w:tcW w:w="892" w:type="dxa"/>
+            <w:tcBorders>
+              <w:top w:val="nil"/>
+              <w:bottom w:val="nil"/>
+            </w:tcBorders>
+          </w:tcPr>
+          <w:p>
+            <w:pPr>
+              <w:snapToGrid w:val="0"/>
+              <w:spacing w:line="300" w:lineRule="auto"/>
+              <w:ind w:firstLine="0" w:firstLineChars="0"/>
+              <w:rPr>
+                <w:rFonts w:ascii="Times New Roman" w:hAnsi="Times New Roman" w:eastAsia="宋体" w:cs="Times New Roman"/>
+                <w:color w:val="000000"/>
+                <w:kern w:val="2"/>
+                <w:sz w:val="15"/>
+                <w:szCs w:val="15"/>
+              </w:rPr>
+            </w:pPr>
+            <w:r>
+              <w:rPr>
+                <w:rFonts w:hint="eastAsia" w:ascii="Times New Roman" w:hAnsi="Times New Roman" w:eastAsia="宋体" w:cs="Times New Roman"/>
+                <w:color w:val="000000"/>
+                <w:kern w:val="2"/>
+                <w:sz w:val="15"/>
+                <w:szCs w:val="15"/>
+              </w:rPr>
+              <w:t>线饼2</w:t>
+            </w:r>
+            <w:r>
+              <w:rPr>
+                <w:rFonts w:ascii="Times New Roman" w:hAnsi="Times New Roman" w:eastAsia="宋体" w:cs="Times New Roman"/>
+                <w:color w:val="000000"/>
+                <w:kern w:val="2"/>
+                <w:sz w:val="15"/>
+                <w:szCs w:val="15"/>
+              </w:rPr>
+              <w:t>0</w:t>
+            </w:r>
+          </w:p>
+        </w:tc>
+        <w:tc>
+          <w:tcPr>
+            <w:tcW w:w="1230" w:type="dxa"/>
+            <w:tcBorders>
+              <w:top w:val="nil"/>
+              <w:bottom w:val="nil"/>
+            </w:tcBorders>
+          </w:tcPr>
+          <w:p>
+            <w:pPr>
+              <w:snapToGrid w:val="0"/>
+              <w:spacing w:line="300" w:lineRule="auto"/>
+              <w:ind w:firstLine="0" w:firstLineChars="0"/>
+              <w:rPr>
+                <w:rFonts w:ascii="Times New Roman" w:hAnsi="Times New Roman" w:eastAsia="宋体" w:cs="Times New Roman"/>
+                <w:color w:val="000000"/>
+                <w:kern w:val="2"/>
+                <w:sz w:val="15"/>
+                <w:szCs w:val="15"/>
+              </w:rPr>
+            </w:pPr>
+            <w:r>
+              <w:rPr>
+                <w:rFonts w:hint="eastAsia" w:ascii="Times New Roman" w:hAnsi="Times New Roman" w:eastAsia="宋体" w:cs="Times New Roman"/>
+                <w:color w:val="000000"/>
+                <w:kern w:val="2"/>
+                <w:sz w:val="15"/>
+                <w:szCs w:val="15"/>
+              </w:rPr>
+              <w:t>3</w:t>
+            </w:r>
+            <w:r>
+              <w:rPr>
+                <w:rFonts w:ascii="Times New Roman" w:hAnsi="Times New Roman" w:eastAsia="宋体" w:cs="Times New Roman"/>
+                <w:color w:val="000000"/>
+                <w:kern w:val="2"/>
+                <w:sz w:val="15"/>
+                <w:szCs w:val="15"/>
+              </w:rPr>
+              <w:t>.36</w:t>
+            </w:r>
+          </w:p>
+        </w:tc>
+        <w:tc>
+          <w:tcPr>
+            <w:tcW w:w="1275" w:type="dxa"/>
+            <w:tcBorders>
+              <w:top w:val="nil"/>
+              <w:bottom w:val="nil"/>
+            </w:tcBorders>
+          </w:tcPr>
+          <w:p>
+            <w:pPr>
+              <w:snapToGrid w:val="0"/>
+              <w:spacing w:line="300" w:lineRule="auto"/>
+              <w:ind w:firstLine="0" w:firstLineChars="0"/>
+              <w:rPr>
+                <w:rFonts w:ascii="Times New Roman" w:hAnsi="Times New Roman" w:eastAsia="宋体" w:cs="Times New Roman"/>
+                <w:color w:val="000000"/>
+                <w:kern w:val="2"/>
+                <w:sz w:val="15"/>
+                <w:szCs w:val="15"/>
+              </w:rPr>
+            </w:pPr>
+            <w:r>
+              <w:rPr>
+                <w:rFonts w:hint="eastAsia" w:ascii="Times New Roman" w:hAnsi="Times New Roman" w:eastAsia="宋体" w:cs="Times New Roman"/>
+                <w:color w:val="000000"/>
+                <w:kern w:val="2"/>
+                <w:sz w:val="15"/>
+                <w:szCs w:val="15"/>
+              </w:rPr>
+              <w:t>2</w:t>
+            </w:r>
+            <w:r>
+              <w:rPr>
+                <w:rFonts w:ascii="Times New Roman" w:hAnsi="Times New Roman" w:eastAsia="宋体" w:cs="Times New Roman"/>
+                <w:color w:val="000000"/>
+                <w:kern w:val="2"/>
+                <w:sz w:val="15"/>
+                <w:szCs w:val="15"/>
+              </w:rPr>
+              <w:t>.60</w:t>
+            </w:r>
+          </w:p>
+        </w:tc>
+        <w:tc>
+          <w:tcPr>
+            <w:tcW w:w="1134" w:type="dxa"/>
+            <w:tcBorders>
+              <w:top w:val="nil"/>
+              <w:bottom w:val="nil"/>
+            </w:tcBorders>
+          </w:tcPr>
+          <w:p>
+            <w:pPr>
+              <w:snapToGrid w:val="0"/>
+              <w:spacing w:line="300" w:lineRule="auto"/>
+              <w:ind w:firstLine="0" w:firstLineChars="0"/>
+              <w:rPr>
+                <w:rFonts w:ascii="Times New Roman" w:hAnsi="Times New Roman" w:eastAsia="宋体" w:cs="Times New Roman"/>
+                <w:color w:val="000000"/>
+                <w:kern w:val="2"/>
+                <w:sz w:val="15"/>
+                <w:szCs w:val="15"/>
+              </w:rPr>
+            </w:pPr>
+            <w:r>
+              <w:rPr>
+                <w:rFonts w:hint="eastAsia" w:ascii="Times New Roman" w:hAnsi="Times New Roman" w:eastAsia="宋体" w:cs="Times New Roman"/>
+                <w:color w:val="000000"/>
+                <w:kern w:val="2"/>
+                <w:sz w:val="15"/>
+                <w:szCs w:val="15"/>
+              </w:rPr>
+              <w:t>0</w:t>
+            </w:r>
+            <w:r>
+              <w:rPr>
+                <w:rFonts w:ascii="Times New Roman" w:hAnsi="Times New Roman" w:eastAsia="宋体" w:cs="Times New Roman"/>
+                <w:color w:val="000000"/>
+                <w:kern w:val="2"/>
+                <w:sz w:val="15"/>
+                <w:szCs w:val="15"/>
+              </w:rPr>
+              <w:t>.81</w:t>
+            </w:r>
+          </w:p>
+        </w:tc>
+      </w:tr>
+      <w:tr>
+        <w:tblPrEx>
+          <w:tblBorders>
+            <w:top w:val="single" w:color="auto" w:sz="6" w:space="0"/>
+            <w:left w:val="none" w:color="auto" w:sz="0" w:space="0"/>
+            <w:bottom w:val="single" w:color="auto" w:sz="6" w:space="0"/>
+            <w:right w:val="none" w:color="auto" w:sz="0" w:space="0"/>
+            <w:insideH w:val="single" w:color="auto" w:sz="4" w:space="0"/>
+            <w:insideV w:val="none" w:color="auto" w:sz="0" w:space="0"/>
+          </w:tblBorders>
+          <w:tblCellMar>
+            <w:top w:w="0" w:type="dxa"/>
+            <w:left w:w="108" w:type="dxa"/>
+            <w:bottom w:w="0" w:type="dxa"/>
+            <w:right w:w="108" w:type="dxa"/>
+          </w:tblCellMar>
+        </w:tblPrEx>
+        <w:trPr>
+          <w:jc w:val="center"/>
+        </w:trPr>
+        <w:tc>
+          <w:tcPr>
+            <w:tcW w:w="892" w:type="dxa"/>
+            <w:tcBorders>
+              <w:top w:val="nil"/>
+              <w:bottom w:val="nil"/>
+            </w:tcBorders>
+          </w:tcPr>
+          <w:p>
+            <w:pPr>
+              <w:snapToGrid w:val="0"/>
+              <w:spacing w:line="300" w:lineRule="auto"/>
+              <w:ind w:firstLine="0" w:firstLineChars="0"/>
+              <w:rPr>
+                <w:rFonts w:ascii="Times New Roman" w:hAnsi="Times New Roman" w:eastAsia="宋体" w:cs="Times New Roman"/>
+                <w:color w:val="000000"/>
+                <w:kern w:val="2"/>
+                <w:sz w:val="15"/>
+                <w:szCs w:val="15"/>
+              </w:rPr>
+            </w:pPr>
+            <w:r>
+              <w:rPr>
+                <w:rFonts w:hint="eastAsia" w:ascii="Times New Roman" w:hAnsi="Times New Roman" w:eastAsia="宋体" w:cs="Times New Roman"/>
+                <w:color w:val="000000"/>
+                <w:kern w:val="2"/>
+                <w:sz w:val="15"/>
+                <w:szCs w:val="15"/>
+              </w:rPr>
+              <w:t>线饼3</w:t>
+            </w:r>
+            <w:r>
+              <w:rPr>
+                <w:rFonts w:ascii="Times New Roman" w:hAnsi="Times New Roman" w:eastAsia="宋体" w:cs="Times New Roman"/>
+                <w:color w:val="000000"/>
+                <w:kern w:val="2"/>
+                <w:sz w:val="15"/>
+                <w:szCs w:val="15"/>
+              </w:rPr>
+              <w:t>0</w:t>
+            </w:r>
+          </w:p>
+        </w:tc>
+        <w:tc>
+          <w:tcPr>
+            <w:tcW w:w="1230" w:type="dxa"/>
+            <w:tcBorders>
+              <w:top w:val="nil"/>
+              <w:bottom w:val="nil"/>
+            </w:tcBorders>
+          </w:tcPr>
+          <w:p>
+            <w:pPr>
+              <w:snapToGrid w:val="0"/>
+              <w:spacing w:line="300" w:lineRule="auto"/>
+              <w:ind w:firstLine="0" w:firstLineChars="0"/>
+              <w:rPr>
+                <w:rFonts w:ascii="Times New Roman" w:hAnsi="Times New Roman" w:eastAsia="宋体" w:cs="Times New Roman"/>
+                <w:color w:val="000000"/>
+                <w:kern w:val="2"/>
+                <w:sz w:val="15"/>
+                <w:szCs w:val="15"/>
+              </w:rPr>
+            </w:pPr>
+            <w:r>
+              <w:rPr>
+                <w:rFonts w:hint="eastAsia" w:ascii="Times New Roman" w:hAnsi="Times New Roman" w:eastAsia="宋体" w:cs="Times New Roman"/>
+                <w:color w:val="000000"/>
+                <w:kern w:val="2"/>
+                <w:sz w:val="15"/>
+                <w:szCs w:val="15"/>
+              </w:rPr>
+              <w:t>3</w:t>
+            </w:r>
+            <w:r>
+              <w:rPr>
+                <w:rFonts w:ascii="Times New Roman" w:hAnsi="Times New Roman" w:eastAsia="宋体" w:cs="Times New Roman"/>
+                <w:color w:val="000000"/>
+                <w:kern w:val="2"/>
+                <w:sz w:val="15"/>
+                <w:szCs w:val="15"/>
+              </w:rPr>
+              <w:t>.31</w:t>
+            </w:r>
+          </w:p>
+        </w:tc>
+        <w:tc>
+          <w:tcPr>
+            <w:tcW w:w="1275" w:type="dxa"/>
+            <w:tcBorders>
+              <w:top w:val="nil"/>
+              <w:bottom w:val="nil"/>
+            </w:tcBorders>
+          </w:tcPr>
+          <w:p>
+            <w:pPr>
+              <w:snapToGrid w:val="0"/>
+              <w:spacing w:line="300" w:lineRule="auto"/>
+              <w:ind w:firstLine="0" w:firstLineChars="0"/>
+              <w:rPr>
+                <w:rFonts w:ascii="Times New Roman" w:hAnsi="Times New Roman" w:eastAsia="宋体" w:cs="Times New Roman"/>
+                <w:color w:val="000000"/>
+                <w:kern w:val="2"/>
+                <w:sz w:val="15"/>
+                <w:szCs w:val="15"/>
+              </w:rPr>
+            </w:pPr>
+            <w:r>
+              <w:rPr>
+                <w:rFonts w:hint="eastAsia" w:ascii="Times New Roman" w:hAnsi="Times New Roman" w:eastAsia="宋体" w:cs="Times New Roman"/>
+                <w:color w:val="000000"/>
+                <w:kern w:val="2"/>
+                <w:sz w:val="15"/>
+                <w:szCs w:val="15"/>
+              </w:rPr>
+              <w:t>2</w:t>
+            </w:r>
+            <w:r>
+              <w:rPr>
+                <w:rFonts w:ascii="Times New Roman" w:hAnsi="Times New Roman" w:eastAsia="宋体" w:cs="Times New Roman"/>
+                <w:color w:val="000000"/>
+                <w:kern w:val="2"/>
+                <w:sz w:val="15"/>
+                <w:szCs w:val="15"/>
+              </w:rPr>
+              <w:t>.12</w:t>
+            </w:r>
+          </w:p>
+        </w:tc>
+        <w:tc>
+          <w:tcPr>
+            <w:tcW w:w="1134" w:type="dxa"/>
+            <w:tcBorders>
+              <w:top w:val="nil"/>
+              <w:bottom w:val="nil"/>
+            </w:tcBorders>
+          </w:tcPr>
+          <w:p>
+            <w:pPr>
+              <w:snapToGrid w:val="0"/>
+              <w:spacing w:line="300" w:lineRule="auto"/>
+              <w:ind w:firstLine="0" w:firstLineChars="0"/>
+              <w:rPr>
+                <w:rFonts w:ascii="Times New Roman" w:hAnsi="Times New Roman" w:eastAsia="宋体" w:cs="Times New Roman"/>
+                <w:color w:val="000000"/>
+                <w:kern w:val="2"/>
+                <w:sz w:val="15"/>
+                <w:szCs w:val="15"/>
+              </w:rPr>
+            </w:pPr>
+            <w:r>
+              <w:rPr>
+                <w:rFonts w:hint="eastAsia" w:ascii="Times New Roman" w:hAnsi="Times New Roman" w:eastAsia="宋体" w:cs="Times New Roman"/>
+                <w:color w:val="000000"/>
+                <w:kern w:val="2"/>
+                <w:sz w:val="15"/>
+                <w:szCs w:val="15"/>
+              </w:rPr>
+              <w:t>1</w:t>
+            </w:r>
+            <w:r>
+              <w:rPr>
+                <w:rFonts w:ascii="Times New Roman" w:hAnsi="Times New Roman" w:eastAsia="宋体" w:cs="Times New Roman"/>
+                <w:color w:val="000000"/>
+                <w:kern w:val="2"/>
+                <w:sz w:val="15"/>
+                <w:szCs w:val="15"/>
+              </w:rPr>
+              <w:t>.02</w:t>
+            </w:r>
+          </w:p>
+        </w:tc>
+      </w:tr>
+      <w:tr>
+        <w:tblPrEx>
+          <w:tblBorders>
+            <w:top w:val="single" w:color="auto" w:sz="6" w:space="0"/>
+            <w:left w:val="none" w:color="auto" w:sz="0" w:space="0"/>
+            <w:bottom w:val="single" w:color="auto" w:sz="6" w:space="0"/>
+            <w:right w:val="none" w:color="auto" w:sz="0" w:space="0"/>
+            <w:insideH w:val="single" w:color="auto" w:sz="4" w:space="0"/>
+            <w:insideV w:val="none" w:color="auto" w:sz="0" w:space="0"/>
+          </w:tblBorders>
+          <w:tblCellMar>
+            <w:top w:w="0" w:type="dxa"/>
+            <w:left w:w="108" w:type="dxa"/>
+            <w:bottom w:w="0" w:type="dxa"/>
+            <w:right w:w="108" w:type="dxa"/>
+          </w:tblCellMar>
+        </w:tblPrEx>
+        <w:trPr>
+          <w:jc w:val="center"/>
+        </w:trPr>
+        <w:tc>
+          <w:tcPr>
+            <w:tcW w:w="892" w:type="dxa"/>
+            <w:tcBorders>
+              <w:top w:val="nil"/>
+              <w:bottom w:val="single" w:color="auto" w:sz="4" w:space="0"/>
+            </w:tcBorders>
+          </w:tcPr>
+          <w:p>
+            <w:pPr>
+              <w:snapToGrid w:val="0"/>
+              <w:spacing w:line="300" w:lineRule="auto"/>
+              <w:ind w:firstLine="0" w:firstLineChars="0"/>
+              <w:rPr>
+                <w:rFonts w:ascii="Times New Roman" w:hAnsi="Times New Roman" w:eastAsia="宋体" w:cs="Times New Roman"/>
+                <w:color w:val="000000"/>
+                <w:kern w:val="2"/>
+                <w:sz w:val="15"/>
+                <w:szCs w:val="15"/>
+              </w:rPr>
+            </w:pPr>
+            <w:r>
+              <w:rPr>
+                <w:rFonts w:hint="eastAsia" w:ascii="Times New Roman" w:hAnsi="Times New Roman" w:eastAsia="宋体" w:cs="Times New Roman"/>
+                <w:color w:val="000000"/>
+                <w:kern w:val="2"/>
+                <w:sz w:val="15"/>
+                <w:szCs w:val="15"/>
+              </w:rPr>
+              <w:t>线饼3</w:t>
+            </w:r>
+            <w:r>
+              <w:rPr>
+                <w:rFonts w:ascii="Times New Roman" w:hAnsi="Times New Roman" w:eastAsia="宋体" w:cs="Times New Roman"/>
+                <w:color w:val="000000"/>
+                <w:kern w:val="2"/>
+                <w:sz w:val="15"/>
+                <w:szCs w:val="15"/>
+              </w:rPr>
+              <w:t>8</w:t>
+            </w:r>
+          </w:p>
+        </w:tc>
+        <w:tc>
+          <w:tcPr>
+            <w:tcW w:w="1230" w:type="dxa"/>
+            <w:tcBorders>
+              <w:top w:val="nil"/>
+              <w:bottom w:val="single" w:color="auto" w:sz="4" w:space="0"/>
+            </w:tcBorders>
+          </w:tcPr>
+          <w:p>
+            <w:pPr>
+              <w:snapToGrid w:val="0"/>
+              <w:spacing w:line="300" w:lineRule="auto"/>
+              <w:ind w:firstLine="0" w:firstLineChars="0"/>
+              <w:rPr>
+                <w:rFonts w:ascii="Times New Roman" w:hAnsi="Times New Roman" w:eastAsia="宋体" w:cs="Times New Roman"/>
+                <w:color w:val="000000"/>
+                <w:kern w:val="2"/>
+                <w:sz w:val="15"/>
+                <w:szCs w:val="15"/>
+              </w:rPr>
+            </w:pPr>
+            <w:r>
+              <w:rPr>
+                <w:rFonts w:hint="eastAsia" w:ascii="Times New Roman" w:hAnsi="Times New Roman" w:eastAsia="宋体" w:cs="Times New Roman"/>
+                <w:color w:val="000000"/>
+                <w:kern w:val="2"/>
+                <w:sz w:val="15"/>
+                <w:szCs w:val="15"/>
+              </w:rPr>
+              <w:t>3</w:t>
+            </w:r>
+            <w:r>
+              <w:rPr>
+                <w:rFonts w:ascii="Times New Roman" w:hAnsi="Times New Roman" w:eastAsia="宋体" w:cs="Times New Roman"/>
+                <w:color w:val="000000"/>
+                <w:kern w:val="2"/>
+                <w:sz w:val="15"/>
+                <w:szCs w:val="15"/>
+              </w:rPr>
+              <w:t>.14</w:t>
+            </w:r>
+          </w:p>
+        </w:tc>
+        <w:tc>
+          <w:tcPr>
+            <w:tcW w:w="1275" w:type="dxa"/>
+            <w:tcBorders>
+              <w:top w:val="nil"/>
+              <w:bottom w:val="single" w:color="auto" w:sz="4" w:space="0"/>
+            </w:tcBorders>
+          </w:tcPr>
+          <w:p>
+            <w:pPr>
+              <w:snapToGrid w:val="0"/>
+              <w:spacing w:line="300" w:lineRule="auto"/>
+              <w:ind w:firstLine="0" w:firstLineChars="0"/>
+              <w:rPr>
+                <w:rFonts w:ascii="Times New Roman" w:hAnsi="Times New Roman" w:eastAsia="宋体" w:cs="Times New Roman"/>
+                <w:color w:val="000000"/>
+                <w:kern w:val="2"/>
+                <w:sz w:val="15"/>
+                <w:szCs w:val="15"/>
+              </w:rPr>
+            </w:pPr>
+            <w:r>
+              <w:rPr>
+                <w:rFonts w:hint="eastAsia" w:ascii="Times New Roman" w:hAnsi="Times New Roman" w:eastAsia="宋体" w:cs="Times New Roman"/>
+                <w:color w:val="000000"/>
+                <w:kern w:val="2"/>
+                <w:sz w:val="15"/>
+                <w:szCs w:val="15"/>
+              </w:rPr>
+              <w:t>3</w:t>
+            </w:r>
+            <w:r>
+              <w:rPr>
+                <w:rFonts w:ascii="Times New Roman" w:hAnsi="Times New Roman" w:eastAsia="宋体" w:cs="Times New Roman"/>
+                <w:color w:val="000000"/>
+                <w:kern w:val="2"/>
+                <w:sz w:val="15"/>
+                <w:szCs w:val="15"/>
+              </w:rPr>
+              <w:t>.04</w:t>
+            </w:r>
+          </w:p>
+        </w:tc>
+        <w:tc>
+          <w:tcPr>
+            <w:tcW w:w="1134" w:type="dxa"/>
+            <w:tcBorders>
+              <w:top w:val="nil"/>
+              <w:bottom w:val="single" w:color="auto" w:sz="4" w:space="0"/>
+            </w:tcBorders>
+          </w:tcPr>
+          <w:p>
+            <w:pPr>
+              <w:snapToGrid w:val="0"/>
+              <w:spacing w:line="300" w:lineRule="auto"/>
+              <w:ind w:firstLine="0" w:firstLineChars="0"/>
+              <w:rPr>
+                <w:rFonts w:ascii="Times New Roman" w:hAnsi="Times New Roman" w:eastAsia="宋体" w:cs="Times New Roman"/>
+                <w:color w:val="000000"/>
+                <w:kern w:val="2"/>
+                <w:sz w:val="15"/>
+                <w:szCs w:val="15"/>
+              </w:rPr>
+            </w:pPr>
+            <w:r>
+              <w:rPr>
+                <w:rFonts w:hint="eastAsia" w:ascii="Times New Roman" w:hAnsi="Times New Roman" w:eastAsia="宋体" w:cs="Times New Roman"/>
+                <w:color w:val="000000"/>
+                <w:kern w:val="2"/>
+                <w:sz w:val="15"/>
+                <w:szCs w:val="15"/>
+              </w:rPr>
+              <w:t>0</w:t>
+            </w:r>
+            <w:r>
+              <w:rPr>
+                <w:rFonts w:ascii="Times New Roman" w:hAnsi="Times New Roman" w:eastAsia="宋体" w:cs="Times New Roman"/>
+                <w:color w:val="000000"/>
+                <w:kern w:val="2"/>
+                <w:sz w:val="15"/>
+                <w:szCs w:val="15"/>
+              </w:rPr>
+              <w:t>.66</w:t>
+            </w:r>
+          </w:p>
+        </w:tc>
+      </w:tr>
+    </w:tbl>
     <w:p>
       <w:pPr>
         <w:ind w:firstLine="480"/>
+        <w:rPr>
+          <w:rFonts w:hint="eastAsia"/>
+        </w:rPr>
       </w:pPr>
-      <w:r>
-        <w:rPr>
-          <w:rFonts w:hint="eastAsia"/>
-        </w:rPr>
-        <w:t>基于上述EDMDC原理和最佳模态，构建EDMDC瞬态磁场和结构力场降阶计算模型。采用EDMDC降阶模型和COMSOL全阶仿真对变压器绕组短路电磁力进行求解，通过绝对平均误差和相对平均误差进行结果对比，磁场误差见图3-58，结构力场误差见图3-59。</w:t>
-      </w:r>
-    </w:p>
-    <w:p>
-      <w:pPr>
-        <w:ind w:firstLine="480"/>
-        <w:jc w:val="center"/>
-        <w:rPr>
-          <w:rFonts w:ascii="方正仿宋_GB2312" w:hAnsi="方正仿宋_GB2312" w:eastAsia="方正仿宋_GB2312" w:cs="方正仿宋_GB2312"/>
-          <w:color w:val="000000"/>
-          <w:szCs w:val="28"/>
-        </w:rPr>
-      </w:pPr>
-      <w:r>
-        <w:rPr>
-          <w:rFonts w:hint="eastAsia" w:ascii="方正仿宋_GB2312" w:hAnsi="方正仿宋_GB2312" w:eastAsia="方正仿宋_GB2312" w:cs="方正仿宋_GB2312"/>
-          <w:color w:val="000000"/>
-          <w:szCs w:val="28"/>
-        </w:rPr>
-        <w:drawing>
-          <wp:inline distT="0" distB="0" distL="0" distR="0">
-            <wp:extent cx="3714750" cy="2329180"/>
-            <wp:effectExtent l="0" t="0" r="0" b="13970"/>
-            <wp:docPr id="27340966" name="图片 1"/>
-            <wp:cNvGraphicFramePr>
-              <a:graphicFrameLocks xmlns:a="http://schemas.openxmlformats.org/drawingml/2006/main" noChangeAspect="1"/>
-            </wp:cNvGraphicFramePr>
-            <a:graphic xmlns:a="http://schemas.openxmlformats.org/drawingml/2006/main">
-              <a:graphicData uri="http://schemas.openxmlformats.org/drawingml/2006/picture">
-                <pic:pic xmlns:pic="http://schemas.openxmlformats.org/drawingml/2006/picture">
-                  <pic:nvPicPr>
-                    <pic:cNvPr id="27340966" name="图片 1"/>
-                    <pic:cNvPicPr>
-                      <a:picLocks noChangeAspect="1"/>
-                    </pic:cNvPicPr>
-                  </pic:nvPicPr>
-                  <pic:blipFill>
-                    <a:blip r:embed="rId11"/>
-                    <a:stretch>
-                      <a:fillRect/>
-                    </a:stretch>
-                  </pic:blipFill>
-                  <pic:spPr>
-                    <a:xfrm>
-                      <a:off x="0" y="0"/>
-                      <a:ext cx="3721437" cy="2333403"/>
-                    </a:xfrm>
-                    <a:prstGeom prst="rect">
-                      <a:avLst/>
-                    </a:prstGeom>
-                  </pic:spPr>
-                </pic:pic>
-              </a:graphicData>
-            </a:graphic>
-          </wp:inline>
-        </w:drawing>
-      </w:r>
-    </w:p>
-    <w:p>
-      <w:pPr>
-        <w:pStyle w:val="37"/>
-        <w:ind w:firstLine="420"/>
-      </w:pPr>
-      <w:r>
-        <w:rPr>
-          <w:rFonts w:hint="eastAsia"/>
-        </w:rPr>
-        <w:t>图3-58 瞬态磁场绝对误差与相对误差</w:t>
-      </w:r>
-    </w:p>
-    <w:p>
-      <w:pPr>
-        <w:ind w:firstLine="480"/>
-      </w:pPr>
-      <w:bookmarkStart w:id="5" w:name="OLE_LINK41"/>
-      <w:r>
-        <w:rPr>
-          <w:rFonts w:hint="eastAsia"/>
-        </w:rPr>
-        <w:t>由图可知，瞬态磁场的绝对平均误差和相对平均误差随着时间的增长而增加，前40个时步瞬态磁场最大绝对误差为0.0535T,最大相对误差为7.53%，</w:t>
-      </w:r>
-      <w:bookmarkStart w:id="6" w:name="OLE_LINK43"/>
-      <w:r>
-        <w:rPr>
-          <w:rFonts w:hint="eastAsia"/>
-        </w:rPr>
-        <w:t>属于工程实践可接受的范围</w:t>
-      </w:r>
-      <w:bookmarkEnd w:id="6"/>
-      <w:r>
-        <w:rPr>
-          <w:rFonts w:hint="eastAsia"/>
-        </w:rPr>
-        <w:t>，故EDMDC模型对于磁场具有较高的预测精度。</w:t>
-      </w:r>
-    </w:p>
-    <w:bookmarkEnd w:id="5"/>
-    <w:p>
-      <w:pPr>
-        <w:ind w:firstLine="480"/>
-        <w:jc w:val="center"/>
-        <w:rPr>
-          <w:rFonts w:ascii="方正仿宋_GB2312" w:hAnsi="方正仿宋_GB2312" w:eastAsia="方正仿宋_GB2312" w:cs="方正仿宋_GB2312"/>
-          <w:color w:val="000000"/>
-          <w:szCs w:val="28"/>
-        </w:rPr>
-      </w:pPr>
-      <w:r>
-        <w:rPr>
-          <w:rFonts w:hint="eastAsia" w:ascii="方正仿宋_GB2312" w:hAnsi="方正仿宋_GB2312" w:eastAsia="方正仿宋_GB2312" w:cs="方正仿宋_GB2312"/>
-          <w:color w:val="000000"/>
-          <w:szCs w:val="28"/>
-        </w:rPr>
-        <w:drawing>
-          <wp:inline distT="0" distB="0" distL="0" distR="0">
-            <wp:extent cx="3565525" cy="2329180"/>
-            <wp:effectExtent l="0" t="0" r="15875" b="13970"/>
-            <wp:docPr id="410632177" name="图片 1"/>
-            <wp:cNvGraphicFramePr>
-              <a:graphicFrameLocks xmlns:a="http://schemas.openxmlformats.org/drawingml/2006/main" noChangeAspect="1"/>
-            </wp:cNvGraphicFramePr>
-            <a:graphic xmlns:a="http://schemas.openxmlformats.org/drawingml/2006/main">
-              <a:graphicData uri="http://schemas.openxmlformats.org/drawingml/2006/picture">
-                <pic:pic xmlns:pic="http://schemas.openxmlformats.org/drawingml/2006/picture">
-                  <pic:nvPicPr>
-                    <pic:cNvPr id="410632177" name="图片 1"/>
-                    <pic:cNvPicPr>
-                      <a:picLocks noChangeAspect="1"/>
-                    </pic:cNvPicPr>
-                  </pic:nvPicPr>
-                  <pic:blipFill>
-                    <a:blip r:embed="rId12"/>
-                    <a:stretch>
-                      <a:fillRect/>
-                    </a:stretch>
-                  </pic:blipFill>
-                  <pic:spPr>
-                    <a:xfrm>
-                      <a:off x="0" y="0"/>
-                      <a:ext cx="3566144" cy="2329200"/>
-                    </a:xfrm>
-                    <a:prstGeom prst="rect">
-                      <a:avLst/>
-                    </a:prstGeom>
-                  </pic:spPr>
-                </pic:pic>
-              </a:graphicData>
-            </a:graphic>
-          </wp:inline>
-        </w:drawing>
-      </w:r>
-    </w:p>
-    <w:p>
-      <w:pPr>
-        <w:pStyle w:val="37"/>
-        <w:ind w:firstLine="420"/>
-      </w:pPr>
-      <w:r>
-        <w:rPr>
-          <w:rFonts w:hint="eastAsia"/>
-        </w:rPr>
-        <w:t>图3-59 结构力场绝对误差与相对误差</w:t>
-      </w:r>
-    </w:p>
-    <w:p>
-      <w:pPr>
-        <w:ind w:firstLine="480"/>
-      </w:pPr>
-      <w:r>
-        <w:rPr>
-          <w:rFonts w:hint="eastAsia"/>
-        </w:rPr>
-        <w:t>由图可知，结构力场计算误差的变化趋势与瞬态磁场相同，前40个时步结构力场最大绝对平均误差为2.144×</w:t>
-      </w:r>
-      <m:oMath>
-        <m:r>
-          <m:rPr/>
-          <w:rPr>
-            <w:rFonts w:ascii="Cambria Math" w:hAnsi="Cambria Math"/>
-          </w:rPr>
-          <m:t>{10}^6</m:t>
-        </m:r>
-        <m:r>
-          <m:rPr>
-            <m:sty m:val="p"/>
-          </m:rPr>
-          <w:rPr>
-            <w:rFonts w:ascii="Cambria Math" w:hAnsi="Cambria Math"/>
-          </w:rPr>
-          <m:t>N/</m:t>
-        </m:r>
-        <m:r>
-          <m:rPr/>
-          <w:rPr>
-            <w:rFonts w:ascii="Cambria Math" w:hAnsi="Cambria Math"/>
-          </w:rPr>
-          <m:t>m^2</m:t>
-        </m:r>
-      </m:oMath>
-      <w:r>
-        <w:rPr>
-          <w:rFonts w:hint="eastAsia"/>
-        </w:rPr>
-        <w:t>,最大相对平均误差为7.52%，属于工程实践可接受的范围，因此EDMDC模型对于结构力场的预测也具有较高精度。</w:t>
-      </w:r>
-    </w:p>
-    <w:p>
-      <w:pPr>
-        <w:ind w:firstLine="480"/>
-      </w:pPr>
-      <w:r>
-        <w:rPr>
-          <w:rFonts w:hint="eastAsia"/>
-        </w:rPr>
-        <w:t>在计算效率上，使用全阶模型计算40个时步耗时约480s，而EDMDC降阶模型仅1.32s，计算效率提高约363.63倍，充分说明了模型计算的快速性，为设备运行时的实时电磁力动态监测提供了高效支撑，大幅提升了绕组电磁力相关工程分析与设计的时效性和实用性。</w:t>
-      </w:r>
     </w:p>
     <w:p/>
     <w:sectPr>
@@ -2070,6 +2894,7 @@
     <w:basedOn w:val="16"/>
     <w:link w:val="4"/>
     <w:semiHidden/>
+    <w:qFormat/>
     <w:uiPriority w:val="9"/>
     <w:rPr>
       <w:rFonts w:asciiTheme="majorHAnsi" w:hAnsiTheme="majorHAnsi" w:eastAsiaTheme="majorEastAsia" w:cstheme="majorBidi"/>
@@ -2110,6 +2935,7 @@
     <w:basedOn w:val="16"/>
     <w:link w:val="7"/>
     <w:semiHidden/>
+    <w:qFormat/>
     <w:uiPriority w:val="9"/>
     <w:rPr>
       <w:rFonts w:cstheme="majorBidi"/>
@@ -2145,6 +2971,7 @@
     <w:basedOn w:val="16"/>
     <w:link w:val="9"/>
     <w:semiHidden/>
+    <w:qFormat/>
     <w:uiPriority w:val="9"/>
     <w:rPr>
       <w:rFonts w:cstheme="majorBidi"/>
@@ -2183,6 +3010,7 @@
     <w:name w:val="标题 字符"/>
     <w:basedOn w:val="16"/>
     <w:link w:val="14"/>
+    <w:qFormat/>
     <w:uiPriority w:val="10"/>
     <w:rPr>
       <w:rFonts w:asciiTheme="majorHAnsi" w:hAnsiTheme="majorHAnsi" w:eastAsiaTheme="majorEastAsia" w:cstheme="majorBidi"/>
@@ -2331,6 +3159,7 @@
     <w:name w:val="页眉 字符"/>
     <w:basedOn w:val="16"/>
     <w:link w:val="12"/>
+    <w:qFormat/>
     <w:uiPriority w:val="99"/>
     <w:rPr>
       <w:sz w:val="18"/>

</xml_diff>